<commit_message>
Module 04: decision-51 follow-up (the run the RECIPE note of 28 Sep announced) - tree model with early stopping in the same LOMO loop: MAE 6.34 (ridge 6.40, uncorrected 6.49), R2 0.016, median best iteration 17/100, no fold near the cap; first-run numbers stand; notebook section, report paragraph (rebuilt), PROVENANCE, RECIPE outcome line, README; rubric checklist written; model_results.json tracked (gitignore exception, as module 03's test_results.json)
Co-Authored-By: Claude Fable 5.1 <noreply@anthropic.com>
</commit_message>
<xml_diff>
--- a/plans/05_delta-probed-ir-pipeline/modules/04_calibrated_harmonic/module_summary.docx
+++ b/plans/05_delta-probed-ir-pipeline/modules/04_calibrated_harmonic/module_summary.docx
@@ -822,6 +822,15 @@
           <w:i w:val="0"/>
         </w:rPr>
         <w:t>No model learns the error (Table 1). The best held-out MAE, 6.40 cm⁻¹ for the ridge regression, improves on the uncorrected library's 6.49 by less than a tenth of a wavenumber; R² is at most 0.008, and the share of bands within 5 cm⁻¹ moves from 57.0% to 58.1%. Figure 1 shows the two residual distributions lying on top of each other, with the same heavy tails; Figure 2 shows that no family improves by more than a fraction of a wavenumber and that the tree model is slightly worse than doing nothing in some families; Figure 3 shows the predicted error hardly varying with the actual one. Two diagnostics locate the cause. An instance-level five-fold split, which lets a molecule sit on both sides, gives the trees an MAE of 6.65 cm⁻¹ — no better — so the failure is not a consequence of the strict split. And the error decomposes into a per-molecule offset with a standard deviation of 2.13 cm⁻¹ and band-to-band scatter within a molecule with a standard deviation of 9.06 cm⁻¹: what a molecule-level descriptor could predict is small, and the band-level descriptors do not predict the rest. Restricting to the 826 strong laboratory bands changes the picture only in level (MAE 5.21 uncorrected, 5.15 with trees). By the recipe's rule the baseline column for the larger project is the ridge regression; the uncertainty layer it provides is wide: 68 % of held-out absolute residuals lie within 6.8 cm⁻¹ and 95 % within 21.9 cm⁻¹.</w:t>
+      </w:r>
+    </w:p>
+    <w:p>
+      <w:r>
+        <w:rPr>
+          <w:b w:val="0"/>
+          <w:i w:val="0"/>
+        </w:rPr>
+        <w:t>Follow-up of 3 October 2026. Under the project's later rule that every trained model uses a validation split with patience and records its best iteration (decision 51 of 27 September 2026), the tree model was rerun with early stopping (validation fraction 0.1, patience 10 iterations) in the same leave-one-molecule-out loop; the numbers of Table 1 stand as run. Result: MAE 6.34 cm⁻¹, RMSE 9.17, R² 0.016, 58.7% of bands within 5 cm⁻¹, with a median best iteration of 17 of 100 and no fold within 10 % of the cap. The trees stop over-fitting and land 0.06 cm⁻¹ below the ridge model, still within a tenth of a wavenumber of the uncorrected library, so the conclusion does not change. Whether the recipe's rule, applied to this run, moves the baseline column from ridge to the trees is a decision for the project's pilot note, not for this report.</w:t>
       </w:r>
     </w:p>
     <w:p>

</xml_diff>

<commit_message>
Lay-reader pass, module 04 (TASKS 20): the target, the scale factor, the matrix and the evaluation in plain words in README, notebook and report; glossary linked; notebook and report rebuilt
Co-Authored-By: Claude Fable 5.1 <noreply@anthropic.com>
</commit_message>
<xml_diff>
--- a/plans/05_delta-probed-ir-pipeline/modules/04_calibrated_harmonic/module_summary.docx
+++ b/plans/05_delta-probed-ir-pipeline/modules/04_calibrated_harmonic/module_summary.docx
@@ -194,6 +194,15 @@
           <w:i w:val="0"/>
         </w:rPr>
         <w:t>I addressed a supervised regression problem: predicting, per infrared band of a polycyclic aromatic hydrocarbon (PAH), the error that NASA's library of scaled-harmonic computed spectra makes against the laboratory band position, from descriptors of the band and the molecule alone. The dataset is a paired table I derived from two public libraries of the NASA Ames PAH IR Spectroscopic Database: the computed library version 4.00 (https://www.astrochemistry.org/pahdb/theoretical/4.00; Ricca et al., 2026) and the experimental, argon-matrix library version 3.10 (https://www.astrochemistry.org/pahdb/experimental/3.10; Mattioda et al., 2020). I trained and compared a per-family constant, a ridge regression and a gradient-boosted tree ensemble against the uncorrected library, under a recipe fixed before the first run.</w:t>
+      </w:r>
+    </w:p>
+    <w:p>
+      <w:r>
+        <w:rPr>
+          <w:b w:val="0"/>
+          <w:i w:val="0"/>
+        </w:rPr>
+        <w:t>For a reader without chemistry: a molecule's infrared spectrum is the list of colours, called band positions and given in the unit cm⁻¹, at which it absorbs infrared light. NASA's library computes these positions and multiplies them by a fixed number slightly below one, a scale factor, to bring them closer to measurements. This report asks whether a machine-learning model can predict the error that remains, band by band, from simple facts about the band and the molecule. Each model is judged on molecules it never saw, by how far its corrected positions still are from the laboratory ones. A one-page glossary accompanies the modules (GLOSSARY.md in the repository).</w:t>
       </w:r>
     </w:p>
     <w:p>

</xml_diff>